<commit_message>
Leave the declaration date blank in Senthamil's report
Matches the other two reports and the sample reports, where the date is
filled in by hand at the time of signing.
</commit_message>
<xml_diff>
--- a/Senthamil Selvan V - SIP Report 2026.docx
+++ b/Senthamil Selvan V - SIP Report 2026.docx
@@ -156,7 +156,7 @@
           <wp:inline distT="0" distB="0" distL="0" distR="0">
             <wp:extent cx="5502910" cy="1157773"/>
             <wp:effectExtent l="0" t="0" r="0" b="0"/>
-            <wp:docPr id="5138" name="MUST and ISSM Business School logo"/>
+            <wp:docPr id="90736" name="MUST and ISSM Business School logo"/>
             <wp:cNvGraphicFramePr>
               <a:graphicFrameLocks xmlns:a="http://schemas.openxmlformats.org/drawingml/2006/main" noChangeAspect="1"/>
             </wp:cNvGraphicFramePr>
@@ -611,7 +611,7 @@
         <w:jc w:val="left"/>
       </w:pPr>
       <w:r>
-        <w:t xml:space="preserve">Date: 10th July 2026</w:t>
+        <w:t xml:space="preserve">Date:</w:t>
       </w:r>
     </w:p>
     <w:p>

</xml_diff>